<commit_message>
29 - Added Documentation for Webserver, Sprint1, Sprint2
</commit_message>
<xml_diff>
--- a/documentation/Sprint1.docx
+++ b/documentation/Sprint1.docx
@@ -32,10 +32,7 @@
         <w:t>Team</w:t>
       </w:r>
       <w:r>
-        <w:t>:</w:t>
-      </w:r>
-      <w:r>
-        <w:t xml:space="preserve"> Sebastian and Felix</w:t>
+        <w:t>: Sebastian and Felix</w:t>
       </w:r>
     </w:p>
     <w:p>
@@ -47,13 +44,7 @@
         <w:t>Repository</w:t>
       </w:r>
       <w:r>
-        <w:t>:</w:t>
-      </w:r>
-      <w:r>
-        <w:t xml:space="preserve"> </w:t>
-      </w:r>
-      <w:r>
-        <w:t xml:space="preserve">https://github.com/BunnySupreme/SWEN3Project  </w:t>
+        <w:t xml:space="preserve">: https://github.com/BunnySupreme/SWEN3Project  </w:t>
       </w:r>
     </w:p>
     <w:p>
@@ -65,19 +56,13 @@
         <w:t>Sprint duration</w:t>
       </w:r>
       <w:r>
-        <w:t xml:space="preserve">: </w:t>
-      </w:r>
-      <w:r>
-        <w:t>08.10.</w:t>
+        <w:t>: 08.10.</w:t>
       </w:r>
       <w:r>
         <w:t>2025</w:t>
       </w:r>
       <w:r>
-        <w:t xml:space="preserve"> – 16.10.</w:t>
-      </w:r>
-      <w:r>
-        <w:t xml:space="preserve"> </w:t>
+        <w:t xml:space="preserve"> – 16.10. </w:t>
       </w:r>
       <w:r>
         <w:t>2025</w:t>
@@ -219,13 +204,7 @@
     </w:p>
     <w:p>
       <w:r>
-        <w:t>REST server paperless</w:t>
-      </w:r>
-      <w:r>
-        <w:t xml:space="preserve"> reachable via http://localhost</w:t>
-      </w:r>
-      <w:r>
-        <w:t xml:space="preserve">:5001 </w:t>
+        <w:t xml:space="preserve">REST server paperless reachable via http://localhost:5001 </w:t>
       </w:r>
     </w:p>
     <w:p/>
@@ -246,24 +225,12 @@
     </w:p>
     <w:p>
       <w:r>
-        <w:t>Entity:</w:t>
-      </w:r>
-      <w:r>
-        <w:t xml:space="preserve"> </w:t>
-      </w:r>
-      <w:r>
-        <w:t>Document</w:t>
-      </w:r>
-    </w:p>
-    <w:p>
-      <w:r>
-        <w:t>F</w:t>
-      </w:r>
-      <w:r>
-        <w:t xml:space="preserve">ields: Id, </w:t>
-      </w:r>
-      <w:r>
-        <w:t xml:space="preserve">Title, Summary, Tags, </w:t>
+        <w:t>Entity: Document</w:t>
+      </w:r>
+    </w:p>
+    <w:p>
+      <w:r>
+        <w:t xml:space="preserve">Fields: Id, Title, Summary, Tags, </w:t>
       </w:r>
       <w:proofErr w:type="spellStart"/>
       <w:r>
@@ -273,10 +240,7 @@
     </w:p>
     <w:p>
       <w:r>
-        <w:t>EF</w:t>
-      </w:r>
-      <w:r>
-        <w:t xml:space="preserve"> Core used with repository pattern:</w:t>
+        <w:t>EF Core used with repository pattern:</w:t>
       </w:r>
     </w:p>
     <w:p>
@@ -290,17 +254,11 @@
       <w:proofErr w:type="spellStart"/>
       <w:proofErr w:type="gramStart"/>
       <w:r>
-        <w:t>IDocumentRepositor</w:t>
-      </w:r>
-      <w:r>
-        <w:t>y</w:t>
+        <w:t>IDocumentRepository</w:t>
       </w:r>
       <w:proofErr w:type="spellEnd"/>
       <w:r>
-        <w:t xml:space="preserve"> </w:t>
-      </w:r>
-      <w:r>
-        <w:t xml:space="preserve"> interface</w:t>
+        <w:t xml:space="preserve">  interface</w:t>
       </w:r>
       <w:proofErr w:type="gramEnd"/>
       <w:r>
@@ -308,9 +266,6 @@
       </w:r>
       <w:proofErr w:type="spellStart"/>
       <w:r>
-        <w:rPr>
-          <w:lang w:val="en-AT"/>
-        </w:rPr>
         <w:t>Paperless.DAL.Repositories</w:t>
       </w:r>
       <w:proofErr w:type="spellEnd"/>
@@ -336,9 +291,6 @@
       </w:r>
       <w:proofErr w:type="spellStart"/>
       <w:r>
-        <w:rPr>
-          <w:lang w:val="en-AT"/>
-        </w:rPr>
         <w:t>Paperless.DAL.Repositories</w:t>
       </w:r>
       <w:proofErr w:type="spellEnd"/>
@@ -361,16 +313,10 @@
       </w:r>
       <w:proofErr w:type="spellStart"/>
       <w:r>
-        <w:rPr>
-          <w:lang w:val="en-AT"/>
-        </w:rPr>
         <w:t>DataContext</w:t>
       </w:r>
       <w:proofErr w:type="spellEnd"/>
       <w:r>
-        <w:rPr>
-          <w:lang w:val="en-AT"/>
-        </w:rPr>
         <w:t xml:space="preserve"> </w:t>
       </w:r>
       <w:r>
@@ -487,10 +433,7 @@
       </w:r>
       <w:proofErr w:type="spellEnd"/>
       <w:r>
-        <w:t xml:space="preserve">/documents/{id}: </w:t>
-      </w:r>
-      <w:r>
-        <w:t>update document metadata</w:t>
+        <w:t>/documents/{id}: update document metadata</w:t>
       </w:r>
     </w:p>
     <w:p>
@@ -502,10 +445,7 @@
         </w:numPr>
       </w:pPr>
       <w:r>
-        <w:t>DELETE</w:t>
-      </w:r>
-      <w:r>
-        <w:t xml:space="preserve"> /</w:t>
+        <w:t>DELETE /</w:t>
       </w:r>
       <w:proofErr w:type="spellStart"/>
       <w:r>
@@ -513,10 +453,7 @@
       </w:r>
       <w:proofErr w:type="spellEnd"/>
       <w:r>
-        <w:t xml:space="preserve">/documents/{id}: </w:t>
-      </w:r>
-      <w:r>
-        <w:t>delete document</w:t>
+        <w:t>/documents/{id}: delete document</w:t>
       </w:r>
     </w:p>
     <w:p>
@@ -548,8 +485,13 @@
         </w:numPr>
       </w:pPr>
       <w:r>
-        <w:t>API layer: DocumentController</w:t>
-      </w:r>
+        <w:t xml:space="preserve">API layer: </w:t>
+      </w:r>
+      <w:proofErr w:type="spellStart"/>
+      <w:r>
+        <w:t>DocumentController</w:t>
+      </w:r>
+      <w:proofErr w:type="spellEnd"/>
     </w:p>
     <w:p>
       <w:pPr>
@@ -581,9 +523,6 @@
       </w:r>
       <w:proofErr w:type="spellStart"/>
       <w:r>
-        <w:rPr>
-          <w:lang w:val="en-AT"/>
-        </w:rPr>
         <w:t>DocumentRepository</w:t>
       </w:r>
       <w:proofErr w:type="spellEnd"/>
@@ -674,7 +613,6 @@
         <w:rPr>
           <w:b/>
           <w:bCs/>
-          <w:lang w:val="en-AT"/>
         </w:rPr>
       </w:pPr>
       <w:r>
@@ -2121,6 +2059,7 @@
   <w:style w:type="character" w:default="1" w:styleId="DefaultParagraphFont">
     <w:name w:val="Default Paragraph Font"/>
     <w:uiPriority w:val="1"/>
+    <w:semiHidden/>
     <w:unhideWhenUsed/>
   </w:style>
   <w:style w:type="table" w:default="1" w:styleId="TableNormal">

</xml_diff>

<commit_message>
29 - Added Time Tracking Documentation, Updated Sprint Documentation
</commit_message>
<xml_diff>
--- a/documentation/Sprint1.docx
+++ b/documentation/Sprint1.docx
@@ -77,7 +77,13 @@
         <w:t>Estimated workload</w:t>
       </w:r>
       <w:r>
-        <w:t>: 10 h / person / week</w:t>
+        <w:t>: 1</w:t>
+      </w:r>
+      <w:r>
+        <w:t>0</w:t>
+      </w:r>
+      <w:r>
+        <w:t xml:space="preserve"> h / person / week</w:t>
       </w:r>
     </w:p>
     <w:p/>
@@ -768,7 +774,10 @@
           </w:tcPr>
           <w:p>
             <w:r>
-              <w:t>10</w:t>
+              <w:t>1</w:t>
+            </w:r>
+            <w:r>
+              <w:t>2</w:t>
             </w:r>
           </w:p>
         </w:tc>
@@ -832,7 +841,10 @@
           </w:tcPr>
           <w:p>
             <w:r>
-              <w:t>10</w:t>
+              <w:t>1</w:t>
+            </w:r>
+            <w:r>
+              <w:t>2</w:t>
             </w:r>
           </w:p>
         </w:tc>

</xml_diff>